<commit_message>
docs(sa): validate playbook end-to-end live; fix python/python3 interpreter gotcha (§2)
Walked the runbook top-to-bottom against the live reference deployment (2026-08-30): offline test 8 passed, cdk list returns aegis-governance-core, all platform verify commands green, benefits synth --all clean, validate_deployment.py PASS + pii_canary PASS, full ingest -> start -> identity-verified approve -> COMMITTED (FINAL# marker), X-Ray 18-node trace + guardrail applied + de-identified invocation log. Only correction: the platform cdk.json runs python3 app.py, so requirements must install to that interpreter (python3 -m pip / python3 -m pytest); added an interpreter-gotcha callout, a venv tooling line, and a walkthrough-status note in Appendix A.

Co-Authored-By: Claude Fable 5 <noreply@anthropic.com>

Claude-Session: https://claude.ai/code/session_01H6R9E992bAAyrPQAdygUwC
</commit_message>
<xml_diff>
--- a/docs/Aegis-SA-Deployment-and-Demo-Playbook.docx
+++ b/docs/Aegis-SA-Deployment-and-Demo-Playbook.docx
@@ -2129,6 +2129,81 @@
         <w:t xml:space="preserve">git, and clones of the platform repo (aegis-ai-governance-platform-aws) and the benefits agent repo (benefits_eligibility_agent).</w:t>
       </w:r>
     </w:p>
+    <w:p>
+      <w:pPr>
+        <w:pStyle w:val="ListParagraph"/>
+        <w:numPr>
+          <w:ilvl w:val="0"/>
+          <w:numId w:val="3"/>
+        </w:numPr>
+        <w:spacing w:after="60" w:before="20" w:line="264"/>
+      </w:pPr>
+      <w:r>
+        <w:rPr>
+          <w:rFonts w:ascii="Calibri" w:cs="Calibri" w:eastAsia="Calibri" w:hAnsi="Calibri"/>
+          <w:b w:val="false"/>
+          <w:bCs w:val="false"/>
+          <w:i w:val="false"/>
+          <w:iCs w:val="false"/>
+          <w:color w:val="222222"/>
+          <w:sz w:val="21"/>
+          <w:szCs w:val="21"/>
+        </w:rPr>
+        <w:t xml:space="preserve">Recommended: a Python virtualenv per repo, so </w:t>
+      </w:r>
+      <w:r>
+        <w:rPr>
+          <w:rFonts w:ascii="Calibri" w:cs="Calibri" w:eastAsia="Calibri" w:hAnsi="Calibri"/>
+          <w:b w:val="false"/>
+          <w:bCs w:val="false"/>
+          <w:i w:val="false"/>
+          <w:iCs w:val="false"/>
+          <w:color w:val="222222"/>
+          <w:sz w:val="18"/>
+          <w:szCs w:val="18"/>
+        </w:rPr>
+        <w:t xml:space="preserve">python</w:t>
+      </w:r>
+      <w:r>
+        <w:rPr>
+          <w:rFonts w:ascii="Calibri" w:cs="Calibri" w:eastAsia="Calibri" w:hAnsi="Calibri"/>
+          <w:b w:val="false"/>
+          <w:bCs w:val="false"/>
+          <w:i w:val="false"/>
+          <w:iCs w:val="false"/>
+          <w:color w:val="222222"/>
+          <w:sz w:val="21"/>
+          <w:szCs w:val="21"/>
+        </w:rPr>
+        <w:t xml:space="preserve">, </w:t>
+      </w:r>
+      <w:r>
+        <w:rPr>
+          <w:rFonts w:ascii="Calibri" w:cs="Calibri" w:eastAsia="Calibri" w:hAnsi="Calibri"/>
+          <w:b w:val="false"/>
+          <w:bCs w:val="false"/>
+          <w:i w:val="false"/>
+          <w:iCs w:val="false"/>
+          <w:color w:val="222222"/>
+          <w:sz w:val="18"/>
+          <w:szCs w:val="18"/>
+        </w:rPr>
+        <w:t xml:space="preserve">python3</w:t>
+      </w:r>
+      <w:r>
+        <w:rPr>
+          <w:rFonts w:ascii="Calibri" w:cs="Calibri" w:eastAsia="Calibri" w:hAnsi="Calibri"/>
+          <w:b w:val="false"/>
+          <w:bCs w:val="false"/>
+          <w:i w:val="false"/>
+          <w:iCs w:val="false"/>
+          <w:color w:val="222222"/>
+          <w:sz w:val="21"/>
+          <w:szCs w:val="21"/>
+        </w:rPr>
+        <w:t xml:space="preserve">, and the CDK app’s subprocess all resolve to the same interpreter (see the interpreter gotcha in §2).</w:t>
+      </w:r>
+    </w:p>
     <w:tbl>
       <w:tblPr>
         <w:tblW w:type="dxa" w:w="9840"/>
@@ -2317,7 +2392,7 @@
           <w:sz w:val="16"/>
           <w:szCs w:val="16"/>
         </w:rPr>
-        <w:t xml:space="preserve">pip install -r requirements.txt pytest</w:t>
+        <w:t xml:space="preserve">python3 -m pip install -r requirements.txt pytest   # SAME interpreter cdk.json invokes</w:t>
       </w:r>
     </w:p>
     <w:p>
@@ -2332,9 +2407,380 @@
           <w:sz w:val="16"/>
           <w:szCs w:val="16"/>
         </w:rPr>
-        <w:t xml:space="preserve">python3 -m pytest tests/ -q          # expect: 8 passed</w:t>
-      </w:r>
-    </w:p>
+        <w:t xml:space="preserve">python3 -m pytest tests/ -q                          # expect: 8 passed</w:t>
+      </w:r>
+    </w:p>
+    <w:tbl>
+      <w:tblPr>
+        <w:tblW w:type="dxa" w:w="9840"/>
+        <w:tblBorders>
+          <w:top w:val="single" w:color="B45F06" w:sz="2"/>
+          <w:left w:val="single" w:color="B45F06" w:sz="18"/>
+          <w:bottom w:val="single" w:color="B45F06" w:sz="2"/>
+          <w:right w:val="single" w:color="B45F06" w:sz="2"/>
+          <w:insideH w:val="none"/>
+          <w:insideV w:val="none"/>
+        </w:tblBorders>
+      </w:tblPr>
+      <w:tblGrid>
+        <w:gridCol w:w="9840"/>
+      </w:tblGrid>
+      <w:tr>
+        <w:tc>
+          <w:tcPr>
+            <w:tcW w:type="dxa" w:w="9840"/>
+            <w:shd w:fill="FBF0E6" w:val="clear"/>
+            <w:tcMar>
+              <w:top w:type="dxa" w:w="100"/>
+              <w:left w:type="dxa" w:w="160"/>
+              <w:bottom w:type="dxa" w:w="100"/>
+              <w:right w:type="dxa" w:w="160"/>
+            </w:tcMar>
+          </w:tcPr>
+          <w:p>
+            <w:pPr>
+              <w:spacing w:after="0" w:before="0" w:line="266"/>
+            </w:pPr>
+            <w:r>
+              <w:rPr>
+                <w:rFonts w:ascii="Calibri" w:cs="Calibri" w:eastAsia="Calibri" w:hAnsi="Calibri"/>
+                <w:b/>
+                <w:bCs/>
+                <w:color w:val="B45F06"/>
+                <w:sz w:val="19"/>
+                <w:szCs w:val="19"/>
+              </w:rPr>
+              <w:t xml:space="preserve">INTERPRETER GOTCHA (found during the live walkthrough)  </w:t>
+            </w:r>
+            <w:r>
+              <w:rPr>
+                <w:rFonts w:ascii="Calibri" w:cs="Calibri" w:eastAsia="Calibri" w:hAnsi="Calibri"/>
+                <w:b w:val="false"/>
+                <w:bCs w:val="false"/>
+                <w:i w:val="false"/>
+                <w:iCs w:val="false"/>
+                <w:color w:val="222222"/>
+                <w:sz w:val="19"/>
+                <w:szCs w:val="19"/>
+              </w:rPr>
+              <w:t xml:space="preserve">The platform’s </w:t>
+            </w:r>
+            <w:r>
+              <w:rPr>
+                <w:rFonts w:ascii="Calibri" w:cs="Calibri" w:eastAsia="Calibri" w:hAnsi="Calibri"/>
+                <w:b w:val="false"/>
+                <w:bCs w:val="false"/>
+                <w:i w:val="false"/>
+                <w:iCs w:val="false"/>
+                <w:color w:val="222222"/>
+                <w:sz w:val="17"/>
+                <w:szCs w:val="17"/>
+              </w:rPr>
+              <w:t xml:space="preserve">cdk.json</w:t>
+            </w:r>
+            <w:r>
+              <w:rPr>
+                <w:rFonts w:ascii="Calibri" w:cs="Calibri" w:eastAsia="Calibri" w:hAnsi="Calibri"/>
+                <w:b w:val="false"/>
+                <w:bCs w:val="false"/>
+                <w:i w:val="false"/>
+                <w:iCs w:val="false"/>
+                <w:color w:val="222222"/>
+                <w:sz w:val="19"/>
+                <w:szCs w:val="19"/>
+              </w:rPr>
+              <w:t xml:space="preserve"> runs </w:t>
+            </w:r>
+            <w:r>
+              <w:rPr>
+                <w:rFonts w:ascii="Calibri" w:cs="Calibri" w:eastAsia="Calibri" w:hAnsi="Calibri"/>
+                <w:b w:val="false"/>
+                <w:bCs w:val="false"/>
+                <w:i w:val="false"/>
+                <w:iCs w:val="false"/>
+                <w:color w:val="222222"/>
+                <w:sz w:val="17"/>
+                <w:szCs w:val="17"/>
+              </w:rPr>
+              <w:t xml:space="preserve">python3 app.py</w:t>
+            </w:r>
+            <w:r>
+              <w:rPr>
+                <w:rFonts w:ascii="Calibri" w:cs="Calibri" w:eastAsia="Calibri" w:hAnsi="Calibri"/>
+                <w:b w:val="false"/>
+                <w:bCs w:val="false"/>
+                <w:i w:val="false"/>
+                <w:iCs w:val="false"/>
+                <w:color w:val="222222"/>
+                <w:sz w:val="19"/>
+                <w:szCs w:val="19"/>
+              </w:rPr>
+              <w:t xml:space="preserve">, so install the requirements for THAT interpreter — use </w:t>
+            </w:r>
+            <w:r>
+              <w:rPr>
+                <w:rFonts w:ascii="Calibri" w:cs="Calibri" w:eastAsia="Calibri" w:hAnsi="Calibri"/>
+                <w:b w:val="false"/>
+                <w:bCs w:val="false"/>
+                <w:i w:val="false"/>
+                <w:iCs w:val="false"/>
+                <w:color w:val="222222"/>
+                <w:sz w:val="17"/>
+                <w:szCs w:val="17"/>
+              </w:rPr>
+              <w:t xml:space="preserve">python3 -m pip …</w:t>
+            </w:r>
+            <w:r>
+              <w:rPr>
+                <w:rFonts w:ascii="Calibri" w:cs="Calibri" w:eastAsia="Calibri" w:hAnsi="Calibri"/>
+                <w:b w:val="false"/>
+                <w:bCs w:val="false"/>
+                <w:i w:val="false"/>
+                <w:iCs w:val="false"/>
+                <w:color w:val="222222"/>
+                <w:sz w:val="19"/>
+                <w:szCs w:val="19"/>
+              </w:rPr>
+              <w:t xml:space="preserve"> (and </w:t>
+            </w:r>
+            <w:r>
+              <w:rPr>
+                <w:rFonts w:ascii="Calibri" w:cs="Calibri" w:eastAsia="Calibri" w:hAnsi="Calibri"/>
+                <w:b w:val="false"/>
+                <w:bCs w:val="false"/>
+                <w:i w:val="false"/>
+                <w:iCs w:val="false"/>
+                <w:color w:val="222222"/>
+                <w:sz w:val="17"/>
+                <w:szCs w:val="17"/>
+              </w:rPr>
+              <w:t xml:space="preserve">python3 -m pytest</w:t>
+            </w:r>
+            <w:r>
+              <w:rPr>
+                <w:rFonts w:ascii="Calibri" w:cs="Calibri" w:eastAsia="Calibri" w:hAnsi="Calibri"/>
+                <w:b w:val="false"/>
+                <w:bCs w:val="false"/>
+                <w:i w:val="false"/>
+                <w:iCs w:val="false"/>
+                <w:color w:val="222222"/>
+                <w:sz w:val="19"/>
+                <w:szCs w:val="19"/>
+              </w:rPr>
+              <w:t xml:space="preserve">), not a bare </w:t>
+            </w:r>
+            <w:r>
+              <w:rPr>
+                <w:rFonts w:ascii="Calibri" w:cs="Calibri" w:eastAsia="Calibri" w:hAnsi="Calibri"/>
+                <w:b w:val="false"/>
+                <w:bCs w:val="false"/>
+                <w:i w:val="false"/>
+                <w:iCs w:val="false"/>
+                <w:color w:val="222222"/>
+                <w:sz w:val="17"/>
+                <w:szCs w:val="17"/>
+              </w:rPr>
+              <w:t xml:space="preserve">pip</w:t>
+            </w:r>
+            <w:r>
+              <w:rPr>
+                <w:rFonts w:ascii="Calibri" w:cs="Calibri" w:eastAsia="Calibri" w:hAnsi="Calibri"/>
+                <w:b w:val="false"/>
+                <w:bCs w:val="false"/>
+                <w:i w:val="false"/>
+                <w:iCs w:val="false"/>
+                <w:color w:val="222222"/>
+                <w:sz w:val="19"/>
+                <w:szCs w:val="19"/>
+              </w:rPr>
+              <w:t xml:space="preserve">. On macOS/Linux a virtualenv makes python / python3 / cdk agree; on Windows </w:t>
+            </w:r>
+            <w:r>
+              <w:rPr>
+                <w:rFonts w:ascii="Calibri" w:cs="Calibri" w:eastAsia="Calibri" w:hAnsi="Calibri"/>
+                <w:b w:val="false"/>
+                <w:bCs w:val="false"/>
+                <w:i w:val="false"/>
+                <w:iCs w:val="false"/>
+                <w:color w:val="222222"/>
+                <w:sz w:val="17"/>
+                <w:szCs w:val="17"/>
+              </w:rPr>
+              <w:t xml:space="preserve">python3</w:t>
+            </w:r>
+            <w:r>
+              <w:rPr>
+                <w:rFonts w:ascii="Calibri" w:cs="Calibri" w:eastAsia="Calibri" w:hAnsi="Calibri"/>
+                <w:b w:val="false"/>
+                <w:bCs w:val="false"/>
+                <w:i w:val="false"/>
+                <w:iCs w:val="false"/>
+                <w:color w:val="222222"/>
+                <w:sz w:val="19"/>
+                <w:szCs w:val="19"/>
+              </w:rPr>
+              <w:t xml:space="preserve"> can resolve to a different install than </w:t>
+            </w:r>
+            <w:r>
+              <w:rPr>
+                <w:rFonts w:ascii="Calibri" w:cs="Calibri" w:eastAsia="Calibri" w:hAnsi="Calibri"/>
+                <w:b w:val="false"/>
+                <w:bCs w:val="false"/>
+                <w:i w:val="false"/>
+                <w:iCs w:val="false"/>
+                <w:color w:val="222222"/>
+                <w:sz w:val="17"/>
+                <w:szCs w:val="17"/>
+              </w:rPr>
+              <w:t xml:space="preserve">python</w:t>
+            </w:r>
+            <w:r>
+              <w:rPr>
+                <w:rFonts w:ascii="Calibri" w:cs="Calibri" w:eastAsia="Calibri" w:hAnsi="Calibri"/>
+                <w:b w:val="false"/>
+                <w:bCs w:val="false"/>
+                <w:i w:val="false"/>
+                <w:iCs w:val="false"/>
+                <w:color w:val="222222"/>
+                <w:sz w:val="19"/>
+                <w:szCs w:val="19"/>
+              </w:rPr>
+              <w:t xml:space="preserve">, so </w:t>
+            </w:r>
+            <w:r>
+              <w:rPr>
+                <w:rFonts w:ascii="Calibri" w:cs="Calibri" w:eastAsia="Calibri" w:hAnsi="Calibri"/>
+                <w:b w:val="false"/>
+                <w:bCs w:val="false"/>
+                <w:i w:val="false"/>
+                <w:iCs w:val="false"/>
+                <w:color w:val="222222"/>
+                <w:sz w:val="17"/>
+                <w:szCs w:val="17"/>
+              </w:rPr>
+              <w:t xml:space="preserve">cdk</w:t>
+            </w:r>
+            <w:r>
+              <w:rPr>
+                <w:rFonts w:ascii="Calibri" w:cs="Calibri" w:eastAsia="Calibri" w:hAnsi="Calibri"/>
+                <w:b w:val="false"/>
+                <w:bCs w:val="false"/>
+                <w:i w:val="false"/>
+                <w:iCs w:val="false"/>
+                <w:color w:val="222222"/>
+                <w:sz w:val="19"/>
+                <w:szCs w:val="19"/>
+              </w:rPr>
+              <w:t xml:space="preserve"> will fail with “No module named aws_cdk” if the deps landed in the other one. Validated live: after installing to </w:t>
+            </w:r>
+            <w:r>
+              <w:rPr>
+                <w:rFonts w:ascii="Calibri" w:cs="Calibri" w:eastAsia="Calibri" w:hAnsi="Calibri"/>
+                <w:b w:val="false"/>
+                <w:bCs w:val="false"/>
+                <w:i w:val="false"/>
+                <w:iCs w:val="false"/>
+                <w:color w:val="222222"/>
+                <w:sz w:val="17"/>
+                <w:szCs w:val="17"/>
+              </w:rPr>
+              <w:t xml:space="preserve">python3</w:t>
+            </w:r>
+            <w:r>
+              <w:rPr>
+                <w:rFonts w:ascii="Calibri" w:cs="Calibri" w:eastAsia="Calibri" w:hAnsi="Calibri"/>
+                <w:b w:val="false"/>
+                <w:bCs w:val="false"/>
+                <w:i w:val="false"/>
+                <w:iCs w:val="false"/>
+                <w:color w:val="222222"/>
+                <w:sz w:val="19"/>
+                <w:szCs w:val="19"/>
+              </w:rPr>
+              <w:t xml:space="preserve">, </w:t>
+            </w:r>
+            <w:r>
+              <w:rPr>
+                <w:rFonts w:ascii="Calibri" w:cs="Calibri" w:eastAsia="Calibri" w:hAnsi="Calibri"/>
+                <w:b w:val="false"/>
+                <w:bCs w:val="false"/>
+                <w:i w:val="false"/>
+                <w:iCs w:val="false"/>
+                <w:color w:val="222222"/>
+                <w:sz w:val="17"/>
+                <w:szCs w:val="17"/>
+              </w:rPr>
+              <w:t xml:space="preserve">cdk list</w:t>
+            </w:r>
+            <w:r>
+              <w:rPr>
+                <w:rFonts w:ascii="Calibri" w:cs="Calibri" w:eastAsia="Calibri" w:hAnsi="Calibri"/>
+                <w:b w:val="false"/>
+                <w:bCs w:val="false"/>
+                <w:i w:val="false"/>
+                <w:iCs w:val="false"/>
+                <w:color w:val="222222"/>
+                <w:sz w:val="19"/>
+                <w:szCs w:val="19"/>
+              </w:rPr>
+              <w:t xml:space="preserve"> returns </w:t>
+            </w:r>
+            <w:r>
+              <w:rPr>
+                <w:rFonts w:ascii="Calibri" w:cs="Calibri" w:eastAsia="Calibri" w:hAnsi="Calibri"/>
+                <w:b w:val="false"/>
+                <w:bCs w:val="false"/>
+                <w:i w:val="false"/>
+                <w:iCs w:val="false"/>
+                <w:color w:val="222222"/>
+                <w:sz w:val="17"/>
+                <w:szCs w:val="17"/>
+              </w:rPr>
+              <w:t xml:space="preserve">aegis-governance-core</w:t>
+            </w:r>
+            <w:r>
+              <w:rPr>
+                <w:rFonts w:ascii="Calibri" w:cs="Calibri" w:eastAsia="Calibri" w:hAnsi="Calibri"/>
+                <w:b w:val="false"/>
+                <w:bCs w:val="false"/>
+                <w:i w:val="false"/>
+                <w:iCs w:val="false"/>
+                <w:color w:val="222222"/>
+                <w:sz w:val="19"/>
+                <w:szCs w:val="19"/>
+              </w:rPr>
+              <w:t xml:space="preserve"> and the §3 deploy command targets it. (The benefits repo’s cdk.json uses </w:t>
+            </w:r>
+            <w:r>
+              <w:rPr>
+                <w:rFonts w:ascii="Calibri" w:cs="Calibri" w:eastAsia="Calibri" w:hAnsi="Calibri"/>
+                <w:b w:val="false"/>
+                <w:bCs w:val="false"/>
+                <w:i w:val="false"/>
+                <w:iCs w:val="false"/>
+                <w:color w:val="222222"/>
+                <w:sz w:val="17"/>
+                <w:szCs w:val="17"/>
+              </w:rPr>
+              <w:t xml:space="preserve">python app.py</w:t>
+            </w:r>
+            <w:r>
+              <w:rPr>
+                <w:rFonts w:ascii="Calibri" w:cs="Calibri" w:eastAsia="Calibri" w:hAnsi="Calibri"/>
+                <w:b w:val="false"/>
+                <w:bCs w:val="false"/>
+                <w:i w:val="false"/>
+                <w:iCs w:val="false"/>
+                <w:color w:val="222222"/>
+                <w:sz w:val="19"/>
+                <w:szCs w:val="19"/>
+              </w:rPr>
+              <w:t xml:space="preserve">, so it works out of the box.)</w:t>
+            </w:r>
+          </w:p>
+        </w:tc>
+      </w:tr>
+    </w:tbl>
     <w:p>
       <w:pPr>
         <w:spacing w:after="90" w:before="40" w:line="266"/>
@@ -2363,7 +2809,7 @@
           <w:sz w:val="18"/>
           <w:szCs w:val="18"/>
         </w:rPr>
-        <w:t xml:space="preserve">pytest</w:t>
+        <w:t xml:space="preserve">python -m pytest</w:t>
       </w:r>
       <w:r>
         <w:rPr>
@@ -9452,6 +9898,65 @@
         <w:t xml:space="preserve">Appendix A · Reference deployment — what was verified live</w:t>
       </w:r>
     </w:p>
+    <w:tbl>
+      <w:tblPr>
+        <w:tblW w:type="dxa" w:w="9840"/>
+        <w:tblBorders>
+          <w:top w:val="single" w:color="1E7145" w:sz="2"/>
+          <w:left w:val="single" w:color="1E7145" w:sz="18"/>
+          <w:bottom w:val="single" w:color="1E7145" w:sz="2"/>
+          <w:right w:val="single" w:color="1E7145" w:sz="2"/>
+          <w:insideH w:val="none"/>
+          <w:insideV w:val="none"/>
+        </w:tblBorders>
+      </w:tblPr>
+      <w:tblGrid>
+        <w:gridCol w:w="9840"/>
+      </w:tblGrid>
+      <w:tr>
+        <w:tc>
+          <w:tcPr>
+            <w:tcW w:type="dxa" w:w="9840"/>
+            <w:shd w:fill="EAF5EE" w:val="clear"/>
+            <w:tcMar>
+              <w:top w:type="dxa" w:w="100"/>
+              <w:left w:type="dxa" w:w="160"/>
+              <w:bottom w:type="dxa" w:w="100"/>
+              <w:right w:type="dxa" w:w="160"/>
+            </w:tcMar>
+          </w:tcPr>
+          <w:p>
+            <w:pPr>
+              <w:spacing w:after="0" w:before="0" w:line="266"/>
+            </w:pPr>
+            <w:r>
+              <w:rPr>
+                <w:rFonts w:ascii="Calibri" w:cs="Calibri" w:eastAsia="Calibri" w:hAnsi="Calibri"/>
+                <w:b/>
+                <w:bCs/>
+                <w:color w:val="1E7145"/>
+                <w:sz w:val="19"/>
+                <w:szCs w:val="19"/>
+              </w:rPr>
+              <w:t xml:space="preserve">WALKTHROUGH STATUS  </w:t>
+            </w:r>
+            <w:r>
+              <w:rPr>
+                <w:rFonts w:ascii="Calibri" w:cs="Calibri" w:eastAsia="Calibri" w:hAnsi="Calibri"/>
+                <w:b w:val="false"/>
+                <w:bCs w:val="false"/>
+                <w:i w:val="false"/>
+                <w:iCs w:val="false"/>
+                <w:color w:val="222222"/>
+                <w:sz w:val="19"/>
+                <w:szCs w:val="19"/>
+              </w:rPr>
+              <w:t xml:space="preserve">This playbook was walked through step by step against the live reference deployment on 2026-08-30 — the offline test, the platform synth/deploy command shape, the account-baseline and platform verify commands, the benefits synth, both agent-validation scripts, a full ingest → start → identity-verified approve → COMMITTED run, and the four-channel prove step — and every step reproduced the documented result. The only correction from that pass is the interpreter note in §2.</w:t>
+            </w:r>
+          </w:p>
+        </w:tc>
+      </w:tr>
+    </w:tbl>
     <w:p>
       <w:pPr>
         <w:spacing w:after="90" w:before="40" w:line="266"/>

</xml_diff>